<commit_message>
feat: Add Tay chatbot (Claude API), proposal restructure & supporting docs
- Tay chatbot: Express proxy server with Claude Sonnet API, section-aware
  context, conversation history, concise response tuning
- Interactive Pitch: new Section 02 (Operating Paradigm), updated suggestions
  per section, larger chat panel, removed date references from CTAs
- New files: Team Roles, Tech Lead Profile, Full Pitch EDITABLE DOCX,
  INTAKE/Full Pitch DOCX generators, Transformation Roadmap XLSX
- Updated bibliography, Strategic Pitch (HTML/DOCX/PPTX), .gitignore (.env)

Co-Authored-By: Claude Opus 4.6 <noreply@anthropic.com>
</commit_message>
<xml_diff>
--- a/Taylor Group/proposal-2.0/pitch/Taylor-Group-Strategic-Pitch.docx
+++ b/Taylor Group/proposal-2.0/pitch/Taylor-Group-Strategic-Pitch.docx
@@ -5006,7 +5006,7 @@
                 <w:sz w:val="20"/>
                 <w:szCs w:val="20"/>
               </w:rPr>
-              <w:t xml:space="preserve">April – May 2026</w:t>
+              <w:t xml:space="preserve">May – June 2026</w:t>
             </w:r>
           </w:p>
         </w:tc>
@@ -5108,7 +5108,7 @@
                 <w:sz w:val="20"/>
                 <w:szCs w:val="20"/>
               </w:rPr>
-              <w:t xml:space="preserve">June 2026</w:t>
+              <w:t xml:space="preserve">July – August 2026</w:t>
             </w:r>
           </w:p>
         </w:tc>
@@ -5210,7 +5210,7 @@
                 <w:sz w:val="20"/>
                 <w:szCs w:val="20"/>
               </w:rPr>
-              <w:t xml:space="preserve">July – October 2026</w:t>
+              <w:t xml:space="preserve">September – December 2026</w:t>
             </w:r>
           </w:p>
         </w:tc>
@@ -5312,7 +5312,7 @@
                 <w:sz w:val="20"/>
                 <w:szCs w:val="20"/>
               </w:rPr>
-              <w:t xml:space="preserve">November 2026+</w:t>
+              <w:t xml:space="preserve">January 2027+</w:t>
             </w:r>
           </w:p>
         </w:tc>
@@ -6947,7 +6947,7 @@
                 <w:sz w:val="20"/>
                 <w:szCs w:val="20"/>
               </w:rPr>
-              <w:t xml:space="preserve">We propose starting with INTAKE in April 2026. This is a contained, fixed-fee engagement that delivers a comprehensive assessment — with no obligation to proceed further. At the end of INTAKE, Taylor will have:</w:t>
+              <w:t xml:space="preserve">We propose starting with INTAKE in May 2026. This is a contained, fixed-fee engagement that delivers a comprehensive assessment — with no obligation to proceed further. At the end of INTAKE, Taylor will have:</w:t>
             </w:r>
           </w:p>
           <w:p>

</xml_diff>